<commit_message>
se actualiza el archivo
</commit_message>
<xml_diff>
--- a/Primer corte/Primer parcial practico/Primer Parcial Practico desarrollo de software terminadofinal.docx
+++ b/Primer corte/Primer parcial practico/Primer Parcial Practico desarrollo de software terminadofinal.docx
@@ -1,6 +1,6 @@
 
 <file path=word/document.xml><?xml version="1.0" encoding="utf-8"?>
-<w:document xmlns:wpc="http://schemas.microsoft.com/office/word/2010/wordprocessingCanvas" xmlns:cx="http://schemas.microsoft.com/office/drawing/2014/chartex" xmlns:cx1="http://schemas.microsoft.com/office/drawing/2015/9/8/chartex" xmlns:cx2="http://schemas.microsoft.com/office/drawing/2015/10/21/chartex" xmlns:cx3="http://schemas.microsoft.com/office/drawing/2016/5/9/chartex" xmlns:cx4="http://schemas.microsoft.com/office/drawing/2016/5/10/chartex" xmlns:cx5="http://schemas.microsoft.com/office/drawing/2016/5/11/chartex" xmlns:cx6="http://schemas.microsoft.com/office/drawing/2016/5/12/chartex" xmlns:cx7="http://schemas.microsoft.com/office/drawing/2016/5/13/chartex" xmlns:cx8="http://schemas.microsoft.com/office/drawing/2016/5/14/chartex" xmlns:mc="http://schemas.openxmlformats.org/markup-compatibility/2006" xmlns:aink="http://schemas.microsoft.com/office/drawing/2016/ink" xmlns:am3d="http://schemas.microsoft.com/office/drawing/2017/model3d" xmlns:o="urn:schemas-microsoft-com:office:office" xmlns:oel="http://schemas.microsoft.com/office/2019/extlst" xmlns:r="http://schemas.openxmlformats.org/officeDocument/2006/relationships" xmlns:m="http://schemas.openxmlformats.org/officeDocument/2006/math" xmlns:v="urn:schemas-microsoft-com:vml" xmlns:wp14="http://schemas.microsoft.com/office/word/2010/wordprocessingDrawing" xmlns:wp="http://schemas.openxmlformats.org/drawingml/2006/wordprocessingDrawing" xmlns:w10="urn:schemas-microsoft-com:office:word" xmlns:w="http://schemas.openxmlformats.org/wordprocessingml/2006/main" xmlns:w14="http://schemas.microsoft.com/office/word/2010/wordml" xmlns:w15="http://schemas.microsoft.com/office/word/2012/wordml" xmlns:w16cex="http://schemas.microsoft.com/office/word/2018/wordml/cex" xmlns:w16cid="http://schemas.microsoft.com/office/word/2016/wordml/cid" xmlns:w16="http://schemas.microsoft.com/office/word/2018/wordml" xmlns:w16du="http://schemas.microsoft.com/office/word/2023/wordml/word16du" xmlns:w16sdtdh="http://schemas.microsoft.com/office/word/2020/wordml/sdtdatahash" xmlns:w16sdtfl="http://schemas.microsoft.com/office/word/2024/wordml/sdtformatlock" xmlns:w16se="http://schemas.microsoft.com/office/word/2015/wordml/symex" xmlns:wpg="http://schemas.microsoft.com/office/word/2010/wordprocessingGroup" xmlns:wpi="http://schemas.microsoft.com/office/word/2010/wordprocessingInk" xmlns:wne="http://schemas.microsoft.com/office/word/2006/wordml" xmlns:wps="http://schemas.microsoft.com/office/word/2010/wordprocessingShape" mc:Ignorable="w14 w15 w16se w16cid w16 w16cex w16sdtdh w16sdtfl w16du wp14">
+<w:document xmlns:wpc="http://schemas.microsoft.com/office/word/2010/wordprocessingCanvas" xmlns:cx="http://schemas.microsoft.com/office/drawing/2014/chartex" xmlns:cx1="http://schemas.microsoft.com/office/drawing/2015/9/8/chartex" xmlns:cx2="http://schemas.microsoft.com/office/drawing/2015/10/21/chartex" xmlns:cx3="http://schemas.microsoft.com/office/drawing/2016/5/9/chartex" xmlns:cx4="http://schemas.microsoft.com/office/drawing/2016/5/10/chartex" xmlns:cx5="http://schemas.microsoft.com/office/drawing/2016/5/11/chartex" xmlns:cx6="http://schemas.microsoft.com/office/drawing/2016/5/12/chartex" xmlns:cx7="http://schemas.microsoft.com/office/drawing/2016/5/13/chartex" xmlns:cx8="http://schemas.microsoft.com/office/drawing/2016/5/14/chartex" xmlns:mc="http://schemas.openxmlformats.org/markup-compatibility/2006" xmlns:aink="http://schemas.microsoft.com/office/drawing/2016/ink" xmlns:am3d="http://schemas.microsoft.com/office/drawing/2017/model3d" xmlns:o="urn:schemas-microsoft-com:office:office" xmlns:r="http://schemas.openxmlformats.org/officeDocument/2006/relationships" xmlns:m="http://schemas.openxmlformats.org/officeDocument/2006/math" xmlns:v="urn:schemas-microsoft-com:vml" xmlns:wp14="http://schemas.microsoft.com/office/word/2010/wordprocessingDrawing" xmlns:wp="http://schemas.openxmlformats.org/drawingml/2006/wordprocessingDrawing" xmlns:w10="urn:schemas-microsoft-com:office:word" xmlns:w="http://schemas.openxmlformats.org/wordprocessingml/2006/main" xmlns:w14="http://schemas.microsoft.com/office/word/2010/wordml" xmlns:w15="http://schemas.microsoft.com/office/word/2012/wordml" xmlns:w16cex="http://schemas.microsoft.com/office/word/2018/wordml/cex" xmlns:w16cid="http://schemas.microsoft.com/office/word/2016/wordml/cid" xmlns:w16="http://schemas.microsoft.com/office/word/2018/wordml" xmlns:w16sdtdh="http://schemas.microsoft.com/office/word/2020/wordml/sdtdatahash" xmlns:w16se="http://schemas.microsoft.com/office/word/2015/wordml/symex" xmlns:wpg="http://schemas.microsoft.com/office/word/2010/wordprocessingGroup" xmlns:wpi="http://schemas.microsoft.com/office/word/2010/wordprocessingInk" xmlns:wne="http://schemas.microsoft.com/office/word/2006/wordml" xmlns:wps="http://schemas.microsoft.com/office/word/2010/wordprocessingShape" mc:Ignorable="w14 w15 w16se w16cid w16 w16cex w16sdtdh wp14">
   <w:body>
     <w:tbl>
       <w:tblPr>
@@ -2830,7 +2830,7 @@
               </wp:anchor>
             </w:drawing>
           </mc:Choice>
-          <mc:Fallback>
+          <mc:Fallback xmlns:w16sdtfl="http://schemas.microsoft.com/office/word/2024/wordml/sdtformatlock" xmlns:w16du="http://schemas.microsoft.com/office/word/2023/wordml/word16du" xmlns:oel="http://schemas.microsoft.com/office/2019/extlst">
             <w:pict>
               <v:rect w14:anchorId="3EFC9B22" id="Rectángulo 1" o:spid="_x0000_s1026" style="position:absolute;margin-left:-1.9pt;margin-top:2.3pt;width:472.85pt;height:241.9pt;z-index:251659264;visibility:visible;mso-wrap-style:square;mso-height-percent:0;mso-wrap-distance-left:9pt;mso-wrap-distance-top:0;mso-wrap-distance-right:9pt;mso-wrap-distance-bottom:0;mso-position-horizontal:absolute;mso-position-horizontal-relative:text;mso-position-vertical:absolute;mso-position-vertical-relative:text;mso-height-percent:0;mso-height-relative:margin;v-text-anchor:middle" o:gfxdata="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" filled="f" strokecolor="#900" strokeweight="1.5pt"/>
             </w:pict>
@@ -5532,13 +5532,23 @@
               </w:rPr>
               <w:t xml:space="preserve">: </w:t>
             </w:r>
-            <w:r>
-              <w:rPr>
-                <w:rFonts w:ascii="Arial" w:eastAsia="Arial" w:hAnsi="Arial" w:cs="Arial"/>
-                <w:sz w:val="22"/>
-                <w:szCs w:val="22"/>
-              </w:rPr>
-              <w:t>Jeronimo Arguello</w:t>
+            <w:proofErr w:type="spellStart"/>
+            <w:r>
+              <w:rPr>
+                <w:rFonts w:ascii="Arial" w:eastAsia="Arial" w:hAnsi="Arial" w:cs="Arial"/>
+                <w:sz w:val="22"/>
+                <w:szCs w:val="22"/>
+              </w:rPr>
+              <w:t>Jeronimo</w:t>
+            </w:r>
+            <w:proofErr w:type="spellEnd"/>
+            <w:r>
+              <w:rPr>
+                <w:rFonts w:ascii="Arial" w:eastAsia="Arial" w:hAnsi="Arial" w:cs="Arial"/>
+                <w:sz w:val="22"/>
+                <w:szCs w:val="22"/>
+              </w:rPr>
+              <w:t xml:space="preserve"> Arguello</w:t>
             </w:r>
             <w:r>
               <w:rPr>
@@ -5860,13 +5870,23 @@
               </w:rPr>
               <w:t>: _</w:t>
             </w:r>
-            <w:r>
-              <w:rPr>
-                <w:rFonts w:ascii="Arial" w:eastAsia="Arial" w:hAnsi="Arial" w:cs="Arial"/>
-                <w:sz w:val="22"/>
-                <w:szCs w:val="22"/>
-              </w:rPr>
-              <w:t>Jeronimo Arguello</w:t>
+            <w:proofErr w:type="spellStart"/>
+            <w:r>
+              <w:rPr>
+                <w:rFonts w:ascii="Arial" w:eastAsia="Arial" w:hAnsi="Arial" w:cs="Arial"/>
+                <w:sz w:val="22"/>
+                <w:szCs w:val="22"/>
+              </w:rPr>
+              <w:t>Jeronimo</w:t>
+            </w:r>
+            <w:proofErr w:type="spellEnd"/>
+            <w:r>
+              <w:rPr>
+                <w:rFonts w:ascii="Arial" w:eastAsia="Arial" w:hAnsi="Arial" w:cs="Arial"/>
+                <w:sz w:val="22"/>
+                <w:szCs w:val="22"/>
+              </w:rPr>
+              <w:t xml:space="preserve"> Arguello</w:t>
             </w:r>
             <w:r>
               <w:rPr>
@@ -6513,13 +6533,23 @@
               </w:rPr>
               <w:t>: _</w:t>
             </w:r>
-            <w:r>
-              <w:rPr>
-                <w:rFonts w:ascii="Arial" w:eastAsia="Arial" w:hAnsi="Arial" w:cs="Arial"/>
-                <w:sz w:val="22"/>
-                <w:szCs w:val="22"/>
-              </w:rPr>
-              <w:t>Jeronimo Arguello</w:t>
+            <w:proofErr w:type="spellStart"/>
+            <w:r>
+              <w:rPr>
+                <w:rFonts w:ascii="Arial" w:eastAsia="Arial" w:hAnsi="Arial" w:cs="Arial"/>
+                <w:sz w:val="22"/>
+                <w:szCs w:val="22"/>
+              </w:rPr>
+              <w:t>Jeronimo</w:t>
+            </w:r>
+            <w:proofErr w:type="spellEnd"/>
+            <w:r>
+              <w:rPr>
+                <w:rFonts w:ascii="Arial" w:eastAsia="Arial" w:hAnsi="Arial" w:cs="Arial"/>
+                <w:sz w:val="22"/>
+                <w:szCs w:val="22"/>
+              </w:rPr>
+              <w:t xml:space="preserve"> Arguello</w:t>
             </w:r>
             <w:r>
               <w:rPr>
@@ -10139,14 +10169,6 @@
     <w:p>
       <w:pPr>
         <w:ind w:left="708" w:hanging="708"/>
-        <w:rPr>
-          <w:rFonts w:ascii="Arial" w:eastAsia="Arial" w:hAnsi="Arial" w:cs="Arial"/>
-          <w:b/>
-          <w:bCs/>
-          <w:color w:val="990000"/>
-          <w:sz w:val="32"/>
-          <w:szCs w:val="32"/>
-        </w:rPr>
       </w:pPr>
       <w:r>
         <w:rPr>
@@ -10166,13 +10188,8 @@
         <w:r>
           <w:rPr>
             <w:rStyle w:val="Hipervnculo"/>
-            <w:rFonts w:ascii="Arial" w:eastAsia="Arial" w:hAnsi="Arial" w:cs="Arial"/>
-            <w:b/>
-            <w:bCs/>
-            <w:sz w:val="32"/>
-            <w:szCs w:val="32"/>
           </w:rPr>
-          <w:t>https://github.com/JeroArguello-py/Repository-arqui-sof/tree/29e41d5061ed6050ad7ed3425c09afadaae441f6/Primer%20corte/Primer%20Parcial</w:t>
+          <w:t>https://github.com/rusorompecraneos/Repositorio-individual-Software/tree/ef7839d5aee3cb12bf0e22f030a9418e8be34dd4/Primer%20corte/Primer%20parcial%20practico</w:t>
         </w:r>
       </w:hyperlink>
       <w:r>
@@ -10184,18 +10201,7 @@
           <w:sz w:val="32"/>
           <w:szCs w:val="32"/>
         </w:rPr>
-        <w:t xml:space="preserve"> </w:t>
-      </w:r>
-      <w:r>
-        <w:rPr>
-          <w:rFonts w:ascii="Arial" w:eastAsia="Arial" w:hAnsi="Arial" w:cs="Arial"/>
-          <w:b/>
-          <w:bCs/>
-          <w:color w:val="990000"/>
-          <w:sz w:val="32"/>
-          <w:szCs w:val="32"/>
-        </w:rPr>
-        <w:t>__________________________________________________</w:t>
+        <w:t>________________</w:t>
       </w:r>
     </w:p>
     <w:sectPr>
@@ -10209,7 +10215,7 @@
 </file>
 
 <file path=word/numbering.xml><?xml version="1.0" encoding="utf-8"?>
-<w:numbering xmlns:wpc="http://schemas.microsoft.com/office/word/2010/wordprocessingCanvas" xmlns:cx="http://schemas.microsoft.com/office/drawing/2014/chartex" xmlns:cx1="http://schemas.microsoft.com/office/drawing/2015/9/8/chartex" xmlns:cx2="http://schemas.microsoft.com/office/drawing/2015/10/21/chartex" xmlns:cx3="http://schemas.microsoft.com/office/drawing/2016/5/9/chartex" xmlns:cx4="http://schemas.microsoft.com/office/drawing/2016/5/10/chartex" xmlns:cx5="http://schemas.microsoft.com/office/drawing/2016/5/11/chartex" xmlns:cx6="http://schemas.microsoft.com/office/drawing/2016/5/12/chartex" xmlns:cx7="http://schemas.microsoft.com/office/drawing/2016/5/13/chartex" xmlns:cx8="http://schemas.microsoft.com/office/drawing/2016/5/14/chartex" xmlns:mc="http://schemas.openxmlformats.org/markup-compatibility/2006" xmlns:aink="http://schemas.microsoft.com/office/drawing/2016/ink" xmlns:am3d="http://schemas.microsoft.com/office/drawing/2017/model3d" xmlns:o="urn:schemas-microsoft-com:office:office" xmlns:oel="http://schemas.microsoft.com/office/2019/extlst" xmlns:r="http://schemas.openxmlformats.org/officeDocument/2006/relationships" xmlns:m="http://schemas.openxmlformats.org/officeDocument/2006/math" xmlns:v="urn:schemas-microsoft-com:vml" xmlns:wp14="http://schemas.microsoft.com/office/word/2010/wordprocessingDrawing" xmlns:wp="http://schemas.openxmlformats.org/drawingml/2006/wordprocessingDrawing" xmlns:w10="urn:schemas-microsoft-com:office:word" xmlns:w="http://schemas.openxmlformats.org/wordprocessingml/2006/main" xmlns:w14="http://schemas.microsoft.com/office/word/2010/wordml" xmlns:w15="http://schemas.microsoft.com/office/word/2012/wordml" xmlns:w16cex="http://schemas.microsoft.com/office/word/2018/wordml/cex" xmlns:w16cid="http://schemas.microsoft.com/office/word/2016/wordml/cid" xmlns:w16="http://schemas.microsoft.com/office/word/2018/wordml" xmlns:w16du="http://schemas.microsoft.com/office/word/2023/wordml/word16du" xmlns:w16sdtdh="http://schemas.microsoft.com/office/word/2020/wordml/sdtdatahash" xmlns:w16sdtfl="http://schemas.microsoft.com/office/word/2024/wordml/sdtformatlock" xmlns:w16se="http://schemas.microsoft.com/office/word/2015/wordml/symex" xmlns:wpg="http://schemas.microsoft.com/office/word/2010/wordprocessingGroup" xmlns:wpi="http://schemas.microsoft.com/office/word/2010/wordprocessingInk" xmlns:wne="http://schemas.microsoft.com/office/word/2006/wordml" xmlns:wps="http://schemas.microsoft.com/office/word/2010/wordprocessingShape" mc:Ignorable="w14 w15 w16se w16cid w16 w16cex w16sdtdh w16sdtfl w16du wp14">
+<w:numbering xmlns:wpc="http://schemas.microsoft.com/office/word/2010/wordprocessingCanvas" xmlns:cx="http://schemas.microsoft.com/office/drawing/2014/chartex" xmlns:cx1="http://schemas.microsoft.com/office/drawing/2015/9/8/chartex" xmlns:cx2="http://schemas.microsoft.com/office/drawing/2015/10/21/chartex" xmlns:cx3="http://schemas.microsoft.com/office/drawing/2016/5/9/chartex" xmlns:cx4="http://schemas.microsoft.com/office/drawing/2016/5/10/chartex" xmlns:cx5="http://schemas.microsoft.com/office/drawing/2016/5/11/chartex" xmlns:cx6="http://schemas.microsoft.com/office/drawing/2016/5/12/chartex" xmlns:cx7="http://schemas.microsoft.com/office/drawing/2016/5/13/chartex" xmlns:cx8="http://schemas.microsoft.com/office/drawing/2016/5/14/chartex" xmlns:mc="http://schemas.openxmlformats.org/markup-compatibility/2006" xmlns:aink="http://schemas.microsoft.com/office/drawing/2016/ink" xmlns:am3d="http://schemas.microsoft.com/office/drawing/2017/model3d" xmlns:o="urn:schemas-microsoft-com:office:office" xmlns:r="http://schemas.openxmlformats.org/officeDocument/2006/relationships" xmlns:m="http://schemas.openxmlformats.org/officeDocument/2006/math" xmlns:v="urn:schemas-microsoft-com:vml" xmlns:wp14="http://schemas.microsoft.com/office/word/2010/wordprocessingDrawing" xmlns:wp="http://schemas.openxmlformats.org/drawingml/2006/wordprocessingDrawing" xmlns:w10="urn:schemas-microsoft-com:office:word" xmlns:w="http://schemas.openxmlformats.org/wordprocessingml/2006/main" xmlns:w14="http://schemas.microsoft.com/office/word/2010/wordml" xmlns:w15="http://schemas.microsoft.com/office/word/2012/wordml" xmlns:w16cex="http://schemas.microsoft.com/office/word/2018/wordml/cex" xmlns:w16cid="http://schemas.microsoft.com/office/word/2016/wordml/cid" xmlns:w16="http://schemas.microsoft.com/office/word/2018/wordml" xmlns:w16sdtdh="http://schemas.microsoft.com/office/word/2020/wordml/sdtdatahash" xmlns:w16se="http://schemas.microsoft.com/office/word/2015/wordml/symex" xmlns:wpg="http://schemas.microsoft.com/office/word/2010/wordprocessingGroup" xmlns:wpi="http://schemas.microsoft.com/office/word/2010/wordprocessingInk" xmlns:wne="http://schemas.microsoft.com/office/word/2006/wordml" xmlns:wps="http://schemas.microsoft.com/office/word/2010/wordprocessingShape" mc:Ignorable="w14 w15 w16se w16cid w16 w16cex w16sdtdh wp14">
   <w:abstractNum w:abstractNumId="0" w15:restartNumberingAfterBreak="0">
     <w:nsid w:val="21FD1C18"/>
     <w:multiLevelType w:val="hybridMultilevel"/>
@@ -10404,13 +10410,13 @@
       </w:pPr>
     </w:lvl>
   </w:abstractNum>
-  <w:num w:numId="1" w16cid:durableId="935409347">
+  <w:num w:numId="1">
     <w:abstractNumId w:val="2"/>
     <w:lvlOverride w:ilvl="0">
       <w:startOverride w:val="1"/>
     </w:lvlOverride>
   </w:num>
-  <w:num w:numId="2" w16cid:durableId="1687361081">
+  <w:num w:numId="2">
     <w:abstractNumId w:val="1"/>
     <w:lvlOverride w:ilvl="0">
       <w:startOverride w:val="1"/>
@@ -10420,7 +10426,7 @@
 </file>
 
 <file path=word/styles.xml><?xml version="1.0" encoding="utf-8"?>
-<w:styles xmlns:mc="http://schemas.openxmlformats.org/markup-compatibility/2006" xmlns:r="http://schemas.openxmlformats.org/officeDocument/2006/relationships" xmlns:w="http://schemas.openxmlformats.org/wordprocessingml/2006/main" xmlns:w14="http://schemas.microsoft.com/office/word/2010/wordml" xmlns:w15="http://schemas.microsoft.com/office/word/2012/wordml" xmlns:w16cex="http://schemas.microsoft.com/office/word/2018/wordml/cex" xmlns:w16cid="http://schemas.microsoft.com/office/word/2016/wordml/cid" xmlns:w16="http://schemas.microsoft.com/office/word/2018/wordml" xmlns:w16du="http://schemas.microsoft.com/office/word/2023/wordml/word16du" xmlns:w16sdtdh="http://schemas.microsoft.com/office/word/2020/wordml/sdtdatahash" xmlns:w16sdtfl="http://schemas.microsoft.com/office/word/2024/wordml/sdtformatlock" xmlns:w16se="http://schemas.microsoft.com/office/word/2015/wordml/symex" mc:Ignorable="w14 w15 w16se w16cid w16 w16cex w16sdtdh w16sdtfl w16du">
+<w:styles xmlns:mc="http://schemas.openxmlformats.org/markup-compatibility/2006" xmlns:r="http://schemas.openxmlformats.org/officeDocument/2006/relationships" xmlns:w="http://schemas.openxmlformats.org/wordprocessingml/2006/main" xmlns:w14="http://schemas.microsoft.com/office/word/2010/wordml" xmlns:w15="http://schemas.microsoft.com/office/word/2012/wordml" xmlns:w16cex="http://schemas.microsoft.com/office/word/2018/wordml/cex" xmlns:w16cid="http://schemas.microsoft.com/office/word/2016/wordml/cid" xmlns:w16="http://schemas.microsoft.com/office/word/2018/wordml" xmlns:w16sdtdh="http://schemas.microsoft.com/office/word/2020/wordml/sdtdatahash" xmlns:w16se="http://schemas.microsoft.com/office/word/2015/wordml/symex" mc:Ignorable="w14 w15 w16se w16cid w16 w16cex w16sdtdh">
   <w:docDefaults>
     <w:rPrDefault>
       <w:rPr>

</xml_diff>